<commit_message>
vault backup: 2026-04-21 13:47:24
</commit_message>
<xml_diff>
--- a/dev/10 Projects/AZT/02-owner/AZT — Полная сверка семядра с Wordstat 2026-04-19.docx
+++ b/dev/10 Projects/AZT/02-owner/AZT — Полная сверка семядра с Wordstat 2026-04-19.docx
@@ -2,7 +2,7 @@
 <file path=word/document.xml><?xml version="1.0" encoding="utf-8"?>
 <w:document xmlns:w="http://schemas.openxmlformats.org/wordprocessingml/2006/main" xmlns:m="http://schemas.openxmlformats.org/officeDocument/2006/math" xmlns:r="http://schemas.openxmlformats.org/officeDocument/2006/relationships" xmlns:o="urn:schemas-microsoft-com:office:office" xmlns:v="urn:schemas-microsoft-com:vml" xmlns:w10="urn:schemas-microsoft-com:office:word" xmlns:a="http://schemas.openxmlformats.org/drawingml/2006/main" xmlns:pic="http://schemas.openxmlformats.org/drawingml/2006/picture" xmlns:wp="http://schemas.openxmlformats.org/drawingml/2006/wordprocessingDrawing">
   <w:body>
-    <w:bookmarkStart w:id="36" w:name="Xb39df55b5aef324ed10ba25bbae9c61c28af1ba"/>
+    <w:bookmarkStart w:id="36" w:name="Xd2eb90bc0f4ddb47aac97665bfc782de1d30a99"/>
     <w:p>
       <w:pPr>
         <w:pStyle w:val="Heading1"/>
@@ -44,12 +44,6 @@
       </w:r>
       <w:r>
         <w:t xml:space="preserve">для всех 417 фраз; базовая РФ 62 корневых запросов групп)</w:t>
-      </w:r>
-      <w:r>
-        <w:t xml:space="preserve"> </w:t>
-      </w:r>
-      <w:r>
-        <w:t xml:space="preserve">Источник: [[AZT — Входное семантическое ядро агентства 2026-04-17-cx]]</w:t>
       </w:r>
       <w:r>
         <w:t xml:space="preserve"> </w:t>
@@ -173,7 +167,7 @@
         <w:t xml:space="preserve">Сверка завершена. Данные Wordstat скачут день ото дня — значения могут отличаться на ±5–15% из-за динамики спроса и шумов Яндекса. Интерпретировать следует не точные числа, а порядок расхождения. Расхождения в разы или на порядок — это не шум, а системная проблема исходного семядра.</w:t>
       </w:r>
     </w:p>
-    <w:bookmarkStart w:id="21" w:name="X6e7bf231c5f3a4d1455f747e0c3b08a5e807800"/>
+    <w:bookmarkStart w:id="21" w:name="X7479b2a0634dcf62f55cd578d952f62a3cacebc"/>
     <w:p>
       <w:pPr>
         <w:pStyle w:val="Heading2"/>
@@ -193,14 +187,14 @@
     <w:tbl>
       <w:tblPr>
         <w:tblStyle w:val="Table"/>
-        <w:tblW w:type="pct" w:w="5000"/>
+        <w:tblW w:type="auto" w:w="0"/>
         <w:tblLook w:firstRow="1" w:lastRow="0" w:firstColumn="0" w:lastColumn="0" w:noHBand="0" w:noVBand="0" w:val="0020"/>
         <w:jc w:val="start"/>
       </w:tblPr>
       <w:tblGrid>
-        <w:gridCol w:w="2160"/>
-        <w:gridCol w:w="2880"/>
-        <w:gridCol w:w="2880"/>
+        <w:gridCol w:w="2640"/>
+        <w:gridCol w:w="2640"/>
+        <w:gridCol w:w="2640"/>
       </w:tblGrid>
       <w:tr>
         <w:trPr>
@@ -624,7 +618,7 @@
         <w:t xml:space="preserve">Топ расхождений</w:t>
       </w:r>
     </w:p>
-    <w:bookmarkStart w:id="22" w:name="X7dbd7f05fcd99e3f7fa17fdfc096de1cf802929"/>
+    <w:bookmarkStart w:id="22" w:name="X3626179f04ba74a9a197627126b21a16e6a8610"/>
     <w:p>
       <w:pPr>
         <w:pStyle w:val="Heading3"/>
@@ -1378,7 +1372,7 @@
       </w:tr>
     </w:tbl>
     <w:bookmarkEnd w:id="22"/>
-    <w:bookmarkStart w:id="23" w:name="X19b7254fb5537b57f4d8aa41f26926c796925b2"/>
+    <w:bookmarkStart w:id="23" w:name="Xd61d5bb2c3703a0d7025106a7b6424148959ee1"/>
     <w:p>
       <w:pPr>
         <w:pStyle w:val="Heading3"/>
@@ -1398,16 +1392,16 @@
     <w:tbl>
       <w:tblPr>
         <w:tblStyle w:val="Table"/>
-        <w:tblW w:type="pct" w:w="5000"/>
+        <w:tblW w:type="auto" w:w="0"/>
         <w:tblLook w:firstRow="1" w:lastRow="0" w:firstColumn="0" w:lastColumn="0" w:noHBand="0" w:noVBand="0" w:val="0020"/>
         <w:jc w:val="start"/>
       </w:tblPr>
       <w:tblGrid>
-        <w:gridCol w:w="1320"/>
-        <w:gridCol w:w="1320"/>
-        <w:gridCol w:w="1760"/>
-        <w:gridCol w:w="1760"/>
-        <w:gridCol w:w="1760"/>
+        <w:gridCol w:w="1584"/>
+        <w:gridCol w:w="1584"/>
+        <w:gridCol w:w="1584"/>
+        <w:gridCol w:w="1584"/>
+        <w:gridCol w:w="1584"/>
       </w:tblGrid>
       <w:tr>
         <w:trPr>
@@ -2628,7 +2622,7 @@
     </w:p>
     <w:bookmarkEnd w:id="25"/>
     <w:bookmarkEnd w:id="26"/>
-    <w:bookmarkStart w:id="28" w:name="X5fa37b8fe3e25509f8e2795b7fcb9523ff746f8"/>
+    <w:bookmarkStart w:id="28" w:name="X81475e6d1ab0cc7ed46c5fc9ef10c446f98db53"/>
     <w:p>
       <w:pPr>
         <w:pStyle w:val="Heading2"/>
@@ -2656,17 +2650,17 @@
     <w:tbl>
       <w:tblPr>
         <w:tblStyle w:val="Table"/>
-        <w:tblW w:type="pct" w:w="5000"/>
+        <w:tblW w:type="auto" w:w="0"/>
         <w:tblLook w:firstRow="1" w:lastRow="0" w:firstColumn="0" w:lastColumn="0" w:noHBand="0" w:noVBand="0" w:val="0020"/>
         <w:jc w:val="start"/>
       </w:tblPr>
       <w:tblGrid>
-        <w:gridCol w:w="1080"/>
-        <w:gridCol w:w="1440"/>
-        <w:gridCol w:w="1440"/>
-        <w:gridCol w:w="1080"/>
-        <w:gridCol w:w="1440"/>
-        <w:gridCol w:w="1440"/>
+        <w:gridCol w:w="1320"/>
+        <w:gridCol w:w="1320"/>
+        <w:gridCol w:w="1320"/>
+        <w:gridCol w:w="1320"/>
+        <w:gridCol w:w="1320"/>
+        <w:gridCol w:w="1320"/>
       </w:tblGrid>
       <w:tr>
         <w:trPr>
@@ -5372,7 +5366,7 @@
         <w:t xml:space="preserve">* Семядро / корень = (сумма базовых фраз исходного семядра по группе) / (базовая РФ корня). Значение &gt;1 — семядро преувеличивает реальный потолок (фразы-подзапросы многократно перекрываются в суммировании). Значение &lt;1 — сумма семядра преуменьшает корень (фразы группы покрывают узкую нишу, а корневой запрос шире и собирает ещё много внеплановых показов).</w:t>
       </w:r>
     </w:p>
-    <w:bookmarkStart w:id="27" w:name="Xc9d97a8975372e263ebfaec4dcf163123a0a7eb"/>
+    <w:bookmarkStart w:id="27" w:name="Xcfd9dbadd6cbcb50d9ff7411f94fe9d286ac03a"/>
     <w:p>
       <w:pPr>
         <w:pStyle w:val="Heading3"/>
@@ -5479,7 +5473,7 @@
     </w:p>
     <w:bookmarkEnd w:id="27"/>
     <w:bookmarkEnd w:id="28"/>
-    <w:bookmarkStart w:id="34" w:name="X7ae0d7156d7cb511b6566987d5f4fb03c99624f"/>
+    <w:bookmarkStart w:id="34" w:name="X65cfa1811210dbe03851efed2802fb8875e5957"/>
     <w:p>
       <w:pPr>
         <w:pStyle w:val="Heading2"/>
@@ -6955,7 +6949,7 @@
       </w:tr>
     </w:tbl>
     <w:bookmarkEnd w:id="30"/>
-    <w:bookmarkStart w:id="31" w:name="X4c62cc981f4d1d604b7b964a022f4ad57adedfb"/>
+    <w:bookmarkStart w:id="31" w:name="X0a136a2237bd32afafb6a8a6d86d56a903d3411"/>
     <w:p>
       <w:pPr>
         <w:pStyle w:val="Heading3"/>
@@ -6975,16 +6969,16 @@
     <w:tbl>
       <w:tblPr>
         <w:tblStyle w:val="Table"/>
-        <w:tblW w:type="pct" w:w="5000"/>
+        <w:tblW w:type="auto" w:w="0"/>
         <w:tblLook w:firstRow="1" w:lastRow="0" w:firstColumn="0" w:lastColumn="0" w:noHBand="0" w:noVBand="0" w:val="0020"/>
         <w:jc w:val="start"/>
       </w:tblPr>
       <w:tblGrid>
-        <w:gridCol w:w="1320"/>
-        <w:gridCol w:w="1320"/>
-        <w:gridCol w:w="1760"/>
-        <w:gridCol w:w="1760"/>
-        <w:gridCol w:w="1760"/>
+        <w:gridCol w:w="1584"/>
+        <w:gridCol w:w="1584"/>
+        <w:gridCol w:w="1584"/>
+        <w:gridCol w:w="1584"/>
+        <w:gridCol w:w="1584"/>
       </w:tblGrid>
       <w:tr>
         <w:trPr>
@@ -7992,7 +7986,7 @@
       </w:tr>
     </w:tbl>
     <w:bookmarkEnd w:id="31"/>
-    <w:bookmarkStart w:id="33" w:name="фраз-с-точной-частотой-0-мёртвые-ключи"/>
+    <w:bookmarkStart w:id="33" w:name="X4ed57556774c8c11ca4c4fbcffe776c570a487e"/>
     <w:p>
       <w:pPr>
         <w:pStyle w:val="Heading3"/>
@@ -8035,7 +8029,7 @@
     <w:tbl>
       <w:tblPr>
         <w:tblStyle w:val="Table"/>
-        <w:tblW w:type="pct" w:w="5000"/>
+        <w:tblW w:type="auto" w:w="0"/>
         <w:tblLook w:firstRow="1" w:lastRow="0" w:firstColumn="0" w:lastColumn="0" w:noHBand="0" w:noVBand="0" w:val="0020"/>
         <w:jc w:val="start"/>
       </w:tblPr>
@@ -9094,19 +9088,19 @@
     <w:tbl>
       <w:tblPr>
         <w:tblStyle w:val="Table"/>
-        <w:tblW w:type="pct" w:w="5000"/>
+        <w:tblW w:type="auto" w:w="0"/>
         <w:tblLook w:firstRow="1" w:lastRow="0" w:firstColumn="0" w:lastColumn="0" w:noHBand="0" w:noVBand="0" w:val="0020"/>
         <w:jc w:val="start"/>
       </w:tblPr>
       <w:tblGrid>
-        <w:gridCol w:w="848"/>
-        <w:gridCol w:w="848"/>
-        <w:gridCol w:w="848"/>
-        <w:gridCol w:w="1131"/>
-        <w:gridCol w:w="1131"/>
-        <w:gridCol w:w="1131"/>
-        <w:gridCol w:w="1131"/>
-        <w:gridCol w:w="848"/>
+        <w:gridCol w:w="990"/>
+        <w:gridCol w:w="990"/>
+        <w:gridCol w:w="990"/>
+        <w:gridCol w:w="990"/>
+        <w:gridCol w:w="990"/>
+        <w:gridCol w:w="990"/>
+        <w:gridCol w:w="990"/>
+        <w:gridCol w:w="990"/>
       </w:tblGrid>
       <w:tr>
         <w:trPr>
@@ -50078,7 +50072,10 @@
     </w:tbl>
     <w:bookmarkEnd w:id="35"/>
     <w:bookmarkEnd w:id="36"/>
-    <w:sectPr/>
+    <w:sectPr>
+      <w:pgSz w:w="16838" w:h="11906" w:orient="landscape"/>
+      <w:pgMar w:top="1134" w:right="1134" w:bottom="1134" w:left="1134" w:header="720" w:footer="720" w:gutter="0"/>
+    </w:sectPr>
   </w:body>
 </w:document>
 </file>

</xml_diff>